<commit_message>
primeros desarrollos creacion de perfiles
</commit_message>
<xml_diff>
--- a/Contrato_Licencia_RioFleteApp.docx
+++ b/Contrato_Licencia_RioFleteApp.docx
@@ -33,62 +33,33 @@
     </w:p>
     <w:p>
       <w:pPr>
-        <w:pBdr>
-          <w:top w:val="single" w:sz="6" w:space="6" w:color="C45911"/>
-          <w:left w:val="single" w:sz="6" w:space="6" w:color="C45911"/>
-          <w:bottom w:val="single" w:sz="6" w:space="6" w:color="C45911"/>
-          <w:right w:val="single" w:sz="6" w:space="6" w:color="C45911"/>
-        </w:pBdr>
-        <w:shd w:val="clear" w:color="auto" w:fill="FFF2E6"/>
-        <w:spacing w:after="240"/>
-      </w:pPr>
+        <w:pStyle w:val="Heading1"/>
+      </w:pPr>
+      <w:r>
+        <w:t>Partes</w:t>
+      </w:r>
+    </w:p>
+    <w:p>
+      <w:pPr>
+        <w:spacing w:after="160" w:line="276" w:lineRule="auto"/>
+        <w:jc w:val="both"/>
+      </w:pPr>
+      <w:r>
+        <w:t xml:space="preserve">Entre, por una parte, </w:t>
+      </w:r>
       <w:r>
         <w:rPr>
           <w:b/>
           <w:bCs/>
-          <w:color w:val="C45911"/>
-        </w:rPr>
-        <w:t xml:space="preserve">BORRADOR — </w:t>
-      </w:r>
-      <w:r>
-        <w:rPr>
-          <w:i/>
-          <w:iCs/>
-          <w:color w:val="595959"/>
-        </w:rPr>
-        <w:t>Documento preparado como punto de partida para ser revisado por un abogado especializado en propiedad intelectual y tecnología antes de su firma. No constituye asesoramiento legal. Los datos entre corchetes y las notas en color deben completarse o eliminarse.</w:t>
-      </w:r>
-    </w:p>
-    <w:p>
-      <w:pPr>
-        <w:pStyle w:val="Heading1"/>
-      </w:pPr>
-      <w:r>
-        <w:t>Partes</w:t>
-      </w:r>
-    </w:p>
-    <w:p>
-      <w:pPr>
-        <w:spacing w:after="160" w:line="276" w:lineRule="auto"/>
-        <w:jc w:val="both"/>
-      </w:pPr>
-      <w:r>
-        <w:t xml:space="preserve">Entre, por una parte, </w:t>
+        </w:rPr>
+        <w:t>MATHIA</w:t>
       </w:r>
       <w:r>
         <w:rPr>
           <w:b/>
           <w:bCs/>
         </w:rPr>
-        <w:t xml:space="preserve">MATHIAS </w:t>
-      </w:r>
-      <w:r>
-        <w:rPr>
-          <w:i/>
-          <w:iCs/>
-          <w:color w:val="1F4E79"/>
-        </w:rPr>
-        <w:t>[apellido]</w:t>
+        <w:t>S VILLANUEVA</w:t>
       </w:r>
       <w:r>
         <w:t xml:space="preserve">, titular del DNI </w:t>
@@ -102,23 +73,13 @@
         <w:t xml:space="preserve"> </w:t>
       </w:r>
       <w:r>
-        <w:rPr>
-          <w:i/>
-          <w:iCs/>
-          <w:color w:val="1F4E79"/>
-        </w:rPr>
-        <w:t>[......]</w:t>
+        <w:t>41.122.737</w:t>
       </w:r>
       <w:r>
         <w:t xml:space="preserve">, con domicilio en </w:t>
       </w:r>
       <w:r>
-        <w:rPr>
-          <w:i/>
-          <w:iCs/>
-          <w:color w:val="1F4E79"/>
-        </w:rPr>
-        <w:t>[domicilio]</w:t>
+        <w:t>Richet 3055 (e) Sta. Lucia, San Juan</w:t>
       </w:r>
       <w:r>
         <w:t xml:space="preserve">, en adelante el </w:t>
@@ -154,271 +115,229 @@
       </w:r>
       <w:r>
         <w:rPr>
-          <w:i/>
-          <w:iCs/>
-          <w:color w:val="1F4E79"/>
-        </w:rPr>
-        <w:t>[Razón social de la empresa]</w:t>
-      </w:r>
-      <w:r>
-        <w:t xml:space="preserve">, CUIT </w:t>
-      </w:r>
-      <w:proofErr w:type="spellStart"/>
-      <w:r>
-        <w:t>N°</w:t>
-      </w:r>
-      <w:proofErr w:type="spellEnd"/>
-      <w:r>
-        <w:t xml:space="preserve"> </w:t>
-      </w:r>
-      <w:r>
-        <w:rPr>
-          <w:i/>
-          <w:iCs/>
-          <w:color w:val="1F4E79"/>
-        </w:rPr>
-        <w:t>[......]</w:t>
-      </w:r>
-      <w:r>
-        <w:t xml:space="preserve">, con domicilio en </w:t>
-      </w:r>
-      <w:r>
-        <w:rPr>
-          <w:i/>
-          <w:iCs/>
-          <w:color w:val="1F4E79"/>
-        </w:rPr>
-        <w:t>[domicilio]</w:t>
-      </w:r>
-      <w:r>
-        <w:t xml:space="preserve">, representada en este acto por </w:t>
-      </w:r>
-      <w:r>
-        <w:rPr>
-          <w:i/>
-          <w:iCs/>
-          <w:color w:val="1F4E79"/>
-        </w:rPr>
-        <w:t>[nombre y cargo del representante]</w:t>
-      </w:r>
-      <w:r>
-        <w:t xml:space="preserve">, en adelante la </w:t>
-      </w:r>
-      <w:r>
-        <w:rPr>
           <w:b/>
           <w:bCs/>
         </w:rPr>
-        <w:t>“LICENCIATARIA”</w:t>
-      </w:r>
-      <w:r>
-        <w:t>;</w:t>
-      </w:r>
-    </w:p>
-    <w:p>
-      <w:pPr>
-        <w:spacing w:after="160" w:line="276" w:lineRule="auto"/>
-        <w:jc w:val="both"/>
-      </w:pPr>
-      <w:r>
-        <w:t>denominadas conjuntamente “las Partes”, quienes acuerdan celebrar el presente Contrato de Licencia de Uso de Software (el “Contrato”), sujeto a las siguientes cláusulas y a los antecedentes que se exponen a continuación.</w:t>
-      </w:r>
-    </w:p>
-    <w:p>
-      <w:pPr>
-        <w:pStyle w:val="Heading1"/>
-      </w:pPr>
-      <w:r>
-        <w:t>Antecedentes</w:t>
-      </w:r>
-    </w:p>
-    <w:p>
-      <w:pPr>
-        <w:spacing w:after="160" w:line="276" w:lineRule="auto"/>
-        <w:jc w:val="both"/>
-      </w:pPr>
-      <w:r>
-        <w:t>Las Partes dejan constancia de los siguientes hechos, que constituyen la causa y el marco del presente Contrato:</w:t>
-      </w:r>
-    </w:p>
-    <w:p>
-      <w:pPr>
-        <w:spacing w:after="160" w:line="276" w:lineRule="auto"/>
-        <w:jc w:val="both"/>
-      </w:pPr>
+        <w:t>YURITI S.A.</w:t>
+      </w:r>
+      <w:r>
+        <w:t>, CUIT N°</w:t>
+      </w:r>
+      <w:r>
+        <w:t>30-70873710-7</w:t>
+      </w:r>
+      <w:r>
+        <w:t xml:space="preserve">, con domicilio en </w:t>
+      </w:r>
+      <w:proofErr w:type="spellStart"/>
+      <w:r>
+        <w:t>Escalabrini</w:t>
+      </w:r>
+      <w:proofErr w:type="spellEnd"/>
+      <w:r>
+        <w:t xml:space="preserve"> Ortiz y Lateral de circunvalación, paseo San Juan Local 220</w:t>
+      </w:r>
+      <w:r>
+        <w:t xml:space="preserve">, representada en este acto por </w:t>
+      </w:r>
+      <w:proofErr w:type="spellStart"/>
+      <w:r>
+        <w:t>Hector</w:t>
+      </w:r>
+      <w:proofErr w:type="spellEnd"/>
+      <w:r>
+        <w:t xml:space="preserve"> </w:t>
+      </w:r>
+      <w:proofErr w:type="spellStart"/>
+      <w:r>
+        <w:t>Lopez</w:t>
+      </w:r>
+      <w:proofErr w:type="spellEnd"/>
+      <w:r>
+        <w:t xml:space="preserve">, en adelante la </w:t>
+      </w:r>
       <w:r>
         <w:rPr>
           <w:b/>
           <w:bCs/>
         </w:rPr>
-        <w:t xml:space="preserve">(a) </w:t>
-      </w:r>
-      <w:r>
-        <w:t xml:space="preserve">El Licenciante desarrolló, por su propia iniciativa y de manera autónoma, una aplicación de software denominada </w:t>
-      </w:r>
+        <w:t>“LICENCIATARIA”</w:t>
+      </w:r>
+      <w:r>
+        <w:t>;</w:t>
+      </w:r>
+    </w:p>
+    <w:p>
+      <w:pPr>
+        <w:spacing w:after="160" w:line="276" w:lineRule="auto"/>
+        <w:jc w:val="both"/>
+      </w:pPr>
+      <w:r>
+        <w:t>denominadas conjuntamente “las Partes”, quienes acuerdan celebrar el presente Contrato de Licencia de Uso de Software (el “Contrato”), sujeto a las siguientes cláusulas y a los antecedentes que se exponen a continuación.</w:t>
+      </w:r>
+    </w:p>
+    <w:p>
+      <w:pPr>
+        <w:pStyle w:val="Heading1"/>
+      </w:pPr>
+      <w:r>
+        <w:t>Antecedentes</w:t>
+      </w:r>
+    </w:p>
+    <w:p>
+      <w:pPr>
+        <w:spacing w:after="160" w:line="276" w:lineRule="auto"/>
+        <w:jc w:val="both"/>
+      </w:pPr>
+      <w:r>
+        <w:t>Las Partes dejan constancia de los siguientes hechos, que constituyen la causa y el marco del presente Contrato:</w:t>
+      </w:r>
+    </w:p>
+    <w:p>
+      <w:pPr>
+        <w:spacing w:after="160" w:line="276" w:lineRule="auto"/>
+        <w:jc w:val="both"/>
+      </w:pPr>
       <w:r>
         <w:rPr>
           <w:b/>
           <w:bCs/>
         </w:rPr>
-        <w:t>“Rio Flete App”</w:t>
-      </w:r>
-      <w:r>
-        <w:t xml:space="preserve"> (el “Software”), destinada a la gestión integral del ciclo de entregas, con controles </w:t>
-      </w:r>
-      <w:proofErr w:type="spellStart"/>
-      <w:r>
-        <w:t>anti-fraude</w:t>
-      </w:r>
-      <w:proofErr w:type="spellEnd"/>
-      <w:r>
-        <w:t>, verificación de identidad y conciliación de pagos.</w:t>
-      </w:r>
-    </w:p>
-    <w:p>
-      <w:pPr>
-        <w:spacing w:after="160" w:line="276" w:lineRule="auto"/>
-        <w:jc w:val="both"/>
-      </w:pPr>
+        <w:t xml:space="preserve">(a) </w:t>
+      </w:r>
+      <w:r>
+        <w:t xml:space="preserve">El Licenciante desarrolló, por su propia iniciativa y de manera autónoma, una aplicación de software denominada </w:t>
+      </w:r>
       <w:r>
         <w:rPr>
           <w:b/>
           <w:bCs/>
         </w:rPr>
-        <w:t xml:space="preserve">(b) </w:t>
-      </w:r>
-      <w:r>
-        <w:t xml:space="preserve">El vínculo laboral del Licenciante con la Licenciataria corresponde a tareas de </w:t>
-      </w:r>
+        <w:t>“</w:t>
+      </w:r>
+      <w:proofErr w:type="spellStart"/>
       <w:r>
         <w:rPr>
           <w:b/>
           <w:bCs/>
         </w:rPr>
-        <w:t>ventas y administración</w:t>
-      </w:r>
-      <w:r>
-        <w:t xml:space="preserve">, y </w:t>
+        <w:t>Inter</w:t>
       </w:r>
       <w:r>
         <w:rPr>
           <w:b/>
           <w:bCs/>
         </w:rPr>
-        <w:t>no</w:t>
-      </w:r>
-      <w:r>
-        <w:t xml:space="preserve"> comprende ni ha comprendido el desarrollo de software. El Software no fue producido en el desempeño de las funciones laborales del Licenciante.</w:t>
-      </w:r>
-    </w:p>
-    <w:p>
-      <w:pPr>
-        <w:spacing w:after="160" w:line="276" w:lineRule="auto"/>
-        <w:jc w:val="both"/>
-      </w:pPr>
+        <w:t>Flete</w:t>
+      </w:r>
+      <w:proofErr w:type="spellEnd"/>
       <w:r>
         <w:rPr>
           <w:b/>
           <w:bCs/>
         </w:rPr>
-        <w:t xml:space="preserve">(c) </w:t>
-      </w:r>
-      <w:r>
-        <w:t xml:space="preserve">El Software fue desarrollado </w:t>
-      </w:r>
+        <w:t xml:space="preserve"> App”</w:t>
+      </w:r>
+      <w:r>
+        <w:t xml:space="preserve"> (el “Software”), destinada a la gestión integral del ciclo de entregas, con controles </w:t>
+      </w:r>
+      <w:proofErr w:type="spellStart"/>
+      <w:r>
+        <w:t>anti-fraude</w:t>
+      </w:r>
+      <w:proofErr w:type="spellEnd"/>
+      <w:r>
+        <w:t>, verificación de identidad y conciliación de pagos.</w:t>
+      </w:r>
+    </w:p>
+    <w:p>
+      <w:pPr>
+        <w:spacing w:after="160" w:line="276" w:lineRule="auto"/>
+        <w:jc w:val="both"/>
+      </w:pPr>
       <w:r>
         <w:rPr>
           <w:b/>
           <w:bCs/>
         </w:rPr>
-        <w:t>fuera del horario laboral</w:t>
-      </w:r>
-      <w:r>
-        <w:t xml:space="preserve">, utilizando </w:t>
+        <w:t xml:space="preserve">(b) </w:t>
+      </w:r>
+      <w:r>
+        <w:t xml:space="preserve">El vínculo laboral del Licenciante con la Licenciataria corresponde a tareas de </w:t>
       </w:r>
       <w:r>
         <w:rPr>
           <w:b/>
           <w:bCs/>
         </w:rPr>
-        <w:t>equipos, herramientas y librerías propios del Licenciante</w:t>
-      </w:r>
-      <w:r>
-        <w:t>. En consecuencia, no resulta aplicable el supuesto del artículo 4, inciso d), de la Ley 11.723, y la titularidad del derecho de propiedad intelectual sobre el Software corresponde al Licenciante en su carácter de autor (art. 4, inc. a, Ley 11.723).</w:t>
-      </w:r>
-    </w:p>
-    <w:p>
-      <w:pPr>
-        <w:spacing w:after="160" w:line="276" w:lineRule="auto"/>
-        <w:jc w:val="both"/>
-      </w:pPr>
+        <w:t>ventas y administración</w:t>
+      </w:r>
+      <w:r>
+        <w:t xml:space="preserve">, y </w:t>
+      </w:r>
       <w:r>
         <w:rPr>
           <w:b/>
           <w:bCs/>
         </w:rPr>
-        <w:t xml:space="preserve">(d) </w:t>
-      </w:r>
-      <w:r>
-        <w:t>La Licenciataria tiene interés en utilizar el Software para su operación, y el Licenciante está dispuesto a otorgarle una licencia de uso en los términos de este Contrato, conservando la titularidad y la facultad de licenciarlo a terceros.</w:t>
-      </w:r>
-    </w:p>
-    <w:p>
-      <w:pPr>
-        <w:pBdr>
-          <w:left w:val="single" w:sz="18" w:space="12" w:color="C45911"/>
-        </w:pBdr>
-        <w:spacing w:before="80" w:after="200" w:line="264" w:lineRule="auto"/>
-        <w:ind w:left="200"/>
+        <w:t>no</w:t>
+      </w:r>
+      <w:r>
+        <w:t xml:space="preserve"> comprende ni ha comprendido el desarrollo de software. El Software no fue producido en el desempeño de las funciones laborales del Licenciante.</w:t>
+      </w:r>
+    </w:p>
+    <w:p>
+      <w:pPr>
+        <w:spacing w:after="160" w:line="276" w:lineRule="auto"/>
         <w:jc w:val="both"/>
       </w:pPr>
       <w:r>
         <w:rPr>
           <w:b/>
           <w:bCs/>
-          <w:i/>
-          <w:iCs/>
-          <w:color w:val="C45911"/>
-        </w:rPr>
-        <w:t xml:space="preserve">Nota para revisión legal: </w:t>
-      </w:r>
-      <w:r>
-        <w:rPr>
-          <w:i/>
-          <w:iCs/>
-          <w:color w:val="595959"/>
-        </w:rPr>
-        <w:t xml:space="preserve">Estos antecedentes documentan el fundamento de la titularidad. Conviene conservar evidencia que los respalde (historial de </w:t>
-      </w:r>
-      <w:proofErr w:type="spellStart"/>
-      <w:r>
-        <w:rPr>
-          <w:i/>
-          <w:iCs/>
-          <w:color w:val="595959"/>
-        </w:rPr>
-        <w:t>commits</w:t>
-      </w:r>
-      <w:proofErr w:type="spellEnd"/>
-      <w:r>
-        <w:rPr>
-          <w:i/>
-          <w:iCs/>
-          <w:color w:val="595959"/>
-        </w:rPr>
-        <w:t xml:space="preserve"> con fechas/horarios, equipo personal, contrato laboral de vendedor). Verificar que la descripción del vínculo laboral coincida exactamente con el contrato vigente.</w:t>
-      </w:r>
-    </w:p>
-    <w:p>
-      <w:pPr>
-        <w:spacing w:after="160" w:line="276" w:lineRule="auto"/>
-        <w:jc w:val="both"/>
-      </w:pPr>
+        </w:rPr>
+        <w:t xml:space="preserve">(c) </w:t>
+      </w:r>
+      <w:r>
+        <w:t xml:space="preserve">El Software fue desarrollado utilizando </w:t>
+      </w:r>
       <w:r>
         <w:rPr>
           <w:b/>
           <w:bCs/>
         </w:rPr>
+        <w:t>equipos, herramientas y librerías propios del Licenciante</w:t>
+      </w:r>
+      <w:r>
+        <w:t>. En consecuencia, no resulta aplicable el supuesto del artículo 4, inciso d), de la Ley 11.723, y la titularidad del derecho de propiedad intelectual sobre el Software corresponde al Licenciante en su carácter de autor (art. 4, inc. a, Ley 11.723).</w:t>
+      </w:r>
+    </w:p>
+    <w:p>
+      <w:pPr>
+        <w:spacing w:after="160" w:line="276" w:lineRule="auto"/>
+        <w:jc w:val="both"/>
+      </w:pPr>
+      <w:r>
+        <w:rPr>
+          <w:b/>
+          <w:bCs/>
+        </w:rPr>
+        <w:t xml:space="preserve">(d) </w:t>
+      </w:r>
+      <w:r>
+        <w:t>La Licenciataria tiene interés en utilizar el Software para su operación, y el Licenciante está dispuesto a otorgarle una licencia de uso en los términos de este Contrato, conservando la titularidad y la facultad de licenciarlo a terceros.</w:t>
+      </w:r>
+    </w:p>
+    <w:p>
+      <w:pPr>
+        <w:spacing w:after="160" w:line="276" w:lineRule="auto"/>
+        <w:jc w:val="both"/>
+      </w:pPr>
+      <w:r>
+        <w:rPr>
+          <w:b/>
+          <w:bCs/>
+        </w:rPr>
         <w:t>En virtud de lo expuesto, las Partes convienen:</w:t>
       </w:r>
     </w:p>
@@ -436,7 +355,6 @@
         <w:jc w:val="both"/>
       </w:pPr>
       <w:r>
-        <w:lastRenderedPageBreak/>
         <w:t>A los efectos de este Contrato, los siguientes términos tendrán el significado que se indica:</w:t>
       </w:r>
     </w:p>
@@ -451,7 +369,18 @@
         <w:jc w:val="both"/>
       </w:pPr>
       <w:r>
-        <w:t>“Software”: la aplicación Rio Flete App en su totalidad, incluyendo su código fuente y objeto, su arquitectura, su base de datos, su documentación y todas sus versiones y actualizaciones.</w:t>
+        <w:t xml:space="preserve">“Software”: la aplicación </w:t>
+      </w:r>
+      <w:proofErr w:type="spellStart"/>
+      <w:r>
+        <w:t>Inter</w:t>
+      </w:r>
+      <w:r>
+        <w:t>Flete</w:t>
+      </w:r>
+      <w:proofErr w:type="spellEnd"/>
+      <w:r>
+        <w:t xml:space="preserve"> App en su totalidad, incluyendo su código fuente y objeto, su arquitectura, su base de datos, su documentación y todas sus versiones y actualizaciones.</w:t>
       </w:r>
     </w:p>
     <w:p>
@@ -493,6 +422,7 @@
         <w:jc w:val="both"/>
       </w:pPr>
       <w:r>
+        <w:lastRenderedPageBreak/>
         <w:t>“Desarrollo a Medida”: toda funcionalidad, adaptación o personalización solicitada por la Licenciataria que exceda el Núcleo y el Mantenimiento, encargada y abonada conforme a la Cláusula 5.</w:t>
       </w:r>
     </w:p>
@@ -638,36 +568,43 @@
         <w:jc w:val="both"/>
       </w:pPr>
       <w:r>
+        <w:t>3.4. La licencia se otorga con relación a una (1) Instancia configurada para la Licenciataria. Toda Instancia adicional requerirá acuerdo previo de las Partes.</w:t>
+      </w:r>
+    </w:p>
+    <w:p>
+      <w:pPr>
+        <w:pStyle w:val="Heading1"/>
+      </w:pPr>
+      <w:r>
+        <w:t>Cláusula 4 — Mantenimiento y versiones estables (sin cargo)</w:t>
+      </w:r>
+    </w:p>
+    <w:p>
+      <w:pPr>
+        <w:spacing w:after="160" w:line="276" w:lineRule="auto"/>
+        <w:jc w:val="both"/>
+      </w:pPr>
+      <w:r>
+        <w:t>4.1. El Licenciante proveerá, sin cargo para la Licenciataria, el Mantenimiento del Software, que comprende: la corrección de errores (bugs) del Núcleo, los ajustes menores de funcionamiento y la puesta a disposición de las Versiones Estables que el Licenciante libere.</w:t>
+      </w:r>
+    </w:p>
+    <w:p>
+      <w:pPr>
+        <w:spacing w:after="160" w:line="276" w:lineRule="auto"/>
+        <w:jc w:val="both"/>
+      </w:pPr>
+      <w:r>
+        <w:t>4.2. El Mantenimiento se presta según la disponibilidad razonable del Licenciante, sin sujeción a tiempos de respuesta garantizados ni a niveles de servicio (SLA), salvo que las Partes acuerden lo contrario por escrito.</w:t>
+      </w:r>
+    </w:p>
+    <w:p>
+      <w:pPr>
+        <w:spacing w:after="160" w:line="276" w:lineRule="auto"/>
+        <w:jc w:val="both"/>
+      </w:pPr>
+      <w:r>
         <w:lastRenderedPageBreak/>
-        <w:t>3.4. La licencia se otorga con relación a una (1) Instancia configurada para la Licenciataria. Toda Instancia adicional requerirá acuerdo previo de las Partes.</w:t>
-      </w:r>
-    </w:p>
-    <w:p>
-      <w:pPr>
-        <w:pBdr>
-          <w:left w:val="single" w:sz="18" w:space="12" w:color="C45911"/>
-        </w:pBdr>
-        <w:spacing w:before="80" w:after="200" w:line="264" w:lineRule="auto"/>
-        <w:ind w:left="200"/>
-        <w:jc w:val="both"/>
-      </w:pPr>
-      <w:r>
-        <w:rPr>
-          <w:b/>
-          <w:bCs/>
-          <w:i/>
-          <w:iCs/>
-          <w:color w:val="C45911"/>
-        </w:rPr>
-        <w:t xml:space="preserve">Nota para revisión legal: </w:t>
-      </w:r>
-      <w:r>
-        <w:rPr>
-          <w:i/>
-          <w:iCs/>
-          <w:color w:val="595959"/>
-        </w:rPr>
-        <w:t>Definir si la licencia se otorga a título gratuito o con alguna contraprestación simbólica. El intercambio relevante aquí es: la Licenciataria asume el costo de Infraestructura y el Licenciante cede el uso. Conviene que el contrato refleje esa reciprocidad para que no quede como mera liberalidad revocable.</w:t>
+        <w:t>4.3. No se consideran Mantenimiento, y quedan fuera de la gratuidad: los Desarrollos a Medida, las nuevas funcionalidades, las integraciones con sistemas de terceros, la migración de datos y el soporte derivado de un uso indebido o de modificaciones realizadas por la Licenciataria o terceros.</w:t>
       </w:r>
     </w:p>
     <w:p>
@@ -675,34 +612,34 @@
         <w:pStyle w:val="Heading1"/>
       </w:pPr>
       <w:r>
-        <w:t>Cláusula 4 — Mantenimiento y versiones estables (sin cargo)</w:t>
-      </w:r>
-    </w:p>
-    <w:p>
-      <w:pPr>
-        <w:spacing w:after="160" w:line="276" w:lineRule="auto"/>
-        <w:jc w:val="both"/>
-      </w:pPr>
-      <w:r>
-        <w:t>4.1. El Licenciante proveerá, sin cargo para la Licenciataria, el Mantenimiento del Software, que comprende: la corrección de errores (bugs) del Núcleo, los ajustes menores de funcionamiento y la puesta a disposición de las Versiones Estables que el Licenciante libere.</w:t>
-      </w:r>
-    </w:p>
-    <w:p>
-      <w:pPr>
-        <w:spacing w:after="160" w:line="276" w:lineRule="auto"/>
-        <w:jc w:val="both"/>
-      </w:pPr>
-      <w:r>
-        <w:t>4.2. El Mantenimiento se presta según la disponibilidad razonable del Licenciante, sin sujeción a tiempos de respuesta garantizados ni a niveles de servicio (SLA), salvo que las Partes acuerden lo contrario por escrito.</w:t>
-      </w:r>
-    </w:p>
-    <w:p>
-      <w:pPr>
-        <w:spacing w:after="160" w:line="276" w:lineRule="auto"/>
-        <w:jc w:val="both"/>
-      </w:pPr>
-      <w:r>
-        <w:t>4.3. No se consideran Mantenimiento, y quedan fuera de la gratuidad: los Desarrollos a Medida, las nuevas funcionalidades, las integraciones con sistemas de terceros, la migración de datos y el soporte derivado de un uso indebido o de modificaciones realizadas por la Licenciataria o terceros.</w:t>
+        <w:t>Cláusula 5 — Desarrollos a medida (con cargo)</w:t>
+      </w:r>
+    </w:p>
+    <w:p>
+      <w:pPr>
+        <w:spacing w:after="160" w:line="276" w:lineRule="auto"/>
+        <w:jc w:val="both"/>
+      </w:pPr>
+      <w:r>
+        <w:t>5.1. Todo Desarrollo a Medida será encargado por escrito y abonado por la Licenciataria, conforme al presupuesto que el Licenciante presente y la Licenciataria apruebe en cada caso.</w:t>
+      </w:r>
+    </w:p>
+    <w:p>
+      <w:pPr>
+        <w:spacing w:after="160" w:line="276" w:lineRule="auto"/>
+        <w:jc w:val="both"/>
+      </w:pPr>
+      <w:r>
+        <w:t>5.2. El precio del Desarrollo a Medida retribuye el servicio de desarrollo. No implica cesión de la propiedad intelectual sobre el resultado: todo Desarrollo a Medida queda comprendido en la titularidad del Licenciante conforme a la Cláusula 2.</w:t>
+      </w:r>
+    </w:p>
+    <w:p>
+      <w:pPr>
+        <w:spacing w:after="160" w:line="276" w:lineRule="auto"/>
+        <w:jc w:val="both"/>
+      </w:pPr>
+      <w:r>
+        <w:t>5.3. El Licenciante podrá incorporar al Núcleo, total o parcialmente, las funcionalidades originadas en un Desarrollo a Medida, y ponerlas a disposición de otros clientes. La Licenciataria conserva el derecho de uso de dichas funcionalidades dentro de su Instancia conforme a la Cláusula 3.</w:t>
       </w:r>
     </w:p>
     <w:p>
@@ -710,80 +647,133 @@
         <w:pStyle w:val="Heading1"/>
       </w:pPr>
       <w:r>
-        <w:t>Cláusula 5 — Desarrollos a medida (con cargo)</w:t>
-      </w:r>
-    </w:p>
-    <w:p>
-      <w:pPr>
-        <w:spacing w:after="160" w:line="276" w:lineRule="auto"/>
-        <w:jc w:val="both"/>
-      </w:pPr>
-      <w:r>
-        <w:t>5.1. Todo Desarrollo a Medida será encargado por escrito y abonado por la Licenciataria, conforme al presupuesto que el Licenciante presente y la Licenciataria apruebe en cada caso.</w:t>
-      </w:r>
-    </w:p>
-    <w:p>
-      <w:pPr>
-        <w:spacing w:after="160" w:line="276" w:lineRule="auto"/>
-        <w:jc w:val="both"/>
-      </w:pPr>
-      <w:r>
-        <w:t>5.2. El precio del Desarrollo a Medida retribuye el servicio de desarrollo. No implica cesión de la propiedad intelectual sobre el resultado: todo Desarrollo a Medida queda comprendido en la titularidad del Licenciante conforme a la Cláusula 2.</w:t>
-      </w:r>
-    </w:p>
-    <w:p>
-      <w:pPr>
-        <w:spacing w:after="160" w:line="276" w:lineRule="auto"/>
-        <w:jc w:val="both"/>
-      </w:pPr>
-      <w:r>
-        <w:t>5.3. El Licenciante podrá incorporar al Núcleo, total o parcialmente, las funcionalidades originadas en un Desarrollo a Medida, y ponerlas a disposición de otros clientes. La Licenciataria conserva el derecho de uso de dichas funcionalidades dentro de su Instancia conforme a la Cláusula 3.</w:t>
-      </w:r>
-    </w:p>
-    <w:p>
-      <w:pPr>
-        <w:pBdr>
-          <w:left w:val="single" w:sz="18" w:space="12" w:color="C45911"/>
-        </w:pBdr>
-        <w:spacing w:before="80" w:after="200" w:line="264" w:lineRule="auto"/>
-        <w:ind w:left="200"/>
-        <w:jc w:val="both"/>
-      </w:pPr>
-      <w:r>
-        <w:rPr>
-          <w:b/>
-          <w:bCs/>
-          <w:i/>
-          <w:iCs/>
-          <w:color w:val="C45911"/>
-        </w:rPr>
-        <w:t xml:space="preserve">Nota para revisión legal: </w:t>
-      </w:r>
-      <w:r>
-        <w:rPr>
-          <w:i/>
-          <w:iCs/>
-          <w:color w:val="595959"/>
-        </w:rPr>
-        <w:t>Esta cláusula es central para el modelo open-</w:t>
+        <w:t>Cláusula 6 — Infraestructura, alojamiento y costos</w:t>
+      </w:r>
+    </w:p>
+    <w:p>
+      <w:pPr>
+        <w:spacing w:after="160" w:line="276" w:lineRule="auto"/>
+        <w:jc w:val="both"/>
+      </w:pPr>
+      <w:r>
+        <w:t>6.1. La Infraestructura necesaria para ejecutar la Instancia será contratada, administrada y costeada íntegramente por la Licenciataria, bajo sus propias cuentas y a su nombre.</w:t>
+      </w:r>
+    </w:p>
+    <w:p>
+      <w:pPr>
+        <w:spacing w:after="160" w:line="276" w:lineRule="auto"/>
+        <w:jc w:val="both"/>
+      </w:pPr>
+      <w:r>
+        <w:t>6.2. Todos los costos de alojamiento, base de datos, almacenamiento, dominios y servicios asociados son de cargo exclusivo de la Licenciataria. El Licenciante no asume responsabilidad alguna por dichos costos ni por la continuidad de los servicios contratados por la Licenciataria.</w:t>
+      </w:r>
+    </w:p>
+    <w:p>
+      <w:pPr>
+        <w:spacing w:after="160" w:line="276" w:lineRule="auto"/>
+        <w:jc w:val="both"/>
+      </w:pPr>
+      <w:r>
+        <w:t>6.3. La Licenciataria otorgará al Licenciante los accesos técnicos razonablemente necesarios para prestar el Mantenimiento y los Desarrollos a Medida. El Licenciante usará dichos accesos exclusivamente con esa finalidad.</w:t>
+      </w:r>
+    </w:p>
+    <w:p>
+      <w:pPr>
+        <w:pStyle w:val="Heading1"/>
+      </w:pPr>
+      <w:r>
+        <w:t>Cláusula 7 — Datos personales</w:t>
+      </w:r>
+    </w:p>
+    <w:p>
+      <w:pPr>
+        <w:spacing w:after="160" w:line="276" w:lineRule="auto"/>
+        <w:jc w:val="both"/>
+      </w:pPr>
+      <w:r>
+        <w:t>7.1. Los datos personales tratados a través del Software (entre otros, datos de clientes, documentos de identidad y evidencias de entrega) son recolectados y tratados por cuenta y bajo responsabilidad de la Licenciataria, quien reviste el carácter de responsable del tratamiento conforme a la Ley 25.326 de Protección de Datos Personales.</w:t>
+      </w:r>
+    </w:p>
+    <w:p>
+      <w:pPr>
+        <w:spacing w:after="160" w:line="276" w:lineRule="auto"/>
+        <w:jc w:val="both"/>
+      </w:pPr>
+      <w:r>
+        <w:t>7.2. El Licenciante actúa, en su caso, como prestador técnico que trata datos por cuenta de la Licenciataria, conforme a las instrucciones de esta y exclusivamente para la prestación del Mantenimiento y los Desarrollos a Medida. El Licenciante no utilizará dichos datos para fines propios.</w:t>
+      </w:r>
+    </w:p>
+    <w:p>
+      <w:pPr>
+        <w:spacing w:after="160" w:line="276" w:lineRule="auto"/>
+        <w:jc w:val="both"/>
+      </w:pPr>
+      <w:r>
+        <w:t>7.3. La Licenciataria será responsable del cumplimiento de las obligaciones legales aplicables al tratamiento de datos personales, incluyendo la obtención de los consentimientos y la atención de los derechos de los titulares de los datos.</w:t>
+      </w:r>
+    </w:p>
+    <w:p>
+      <w:pPr>
+        <w:pStyle w:val="Heading1"/>
+      </w:pPr>
+      <w:r>
+        <w:t>Cláusula 8 — Confidencialidad</w:t>
+      </w:r>
+    </w:p>
+    <w:p>
+      <w:pPr>
+        <w:spacing w:after="160" w:line="276" w:lineRule="auto"/>
+        <w:jc w:val="both"/>
+      </w:pPr>
+      <w:r>
+        <w:t xml:space="preserve">8.1. Cada Parte mantendrá la confidencialidad de la información no pública de la otra a la que acceda con motivo de este Contrato, y la usará únicamente para los fines del Contrato. Esta </w:t>
+      </w:r>
+      <w:r>
+        <w:lastRenderedPageBreak/>
+        <w:t>obligación subsiste durante la vigencia y por el plazo de tres (3) años posteriores a su terminación.</w:t>
+      </w:r>
+    </w:p>
+    <w:p>
+      <w:pPr>
+        <w:spacing w:after="160" w:line="276" w:lineRule="auto"/>
+        <w:jc w:val="both"/>
+      </w:pPr>
+      <w:r>
+        <w:t>8.2. El código fuente del Software es información confidencial del Licenciante.</w:t>
+      </w:r>
+    </w:p>
+    <w:p>
+      <w:pPr>
+        <w:pStyle w:val="Heading1"/>
+      </w:pPr>
+      <w:r>
+        <w:t>Cláusula 9 — Garantías y limitación de responsabilidad</w:t>
+      </w:r>
+    </w:p>
+    <w:p>
+      <w:pPr>
+        <w:spacing w:after="160" w:line="276" w:lineRule="auto"/>
+        <w:jc w:val="both"/>
+      </w:pPr>
+      <w:r>
+        <w:t xml:space="preserve">9.1. El Software se provee “en su estado actual” (as </w:t>
       </w:r>
       <w:proofErr w:type="spellStart"/>
       <w:r>
-        <w:rPr>
-          <w:i/>
-          <w:iCs/>
-          <w:color w:val="595959"/>
-        </w:rPr>
-        <w:t>core</w:t>
+        <w:t>is</w:t>
       </w:r>
       <w:proofErr w:type="spellEnd"/>
       <w:r>
-        <w:rPr>
-          <w:i/>
-          <w:iCs/>
-          <w:color w:val="595959"/>
-        </w:rPr>
-        <w:t>: invierte el supuesto habitual de que “quien paga el desarrollo a medida es dueño de él”. Debe quedar absolutamente explícita y ser comprendida por la Licenciataria antes de firmar, porque es la que más fricción suele generar. Considerar si para algún desarrollo puntual se quiere pactar una exclusividad temporal a favor de la Licenciataria (por ejemplo, X meses antes de incorporarlo al Núcleo).</w:t>
+        <w:t>). El Licenciante no garantiza que el Software esté libre de errores ni que su funcionamiento sea ininterrumpido, especialmente respecto de las prestaciones provistas sin cargo.</w:t>
+      </w:r>
+    </w:p>
+    <w:p>
+      <w:pPr>
+        <w:spacing w:after="160" w:line="276" w:lineRule="auto"/>
+        <w:jc w:val="both"/>
+      </w:pPr>
+      <w:r>
+        <w:t>9.2. En la máxima medida permitida por la ley, la responsabilidad del Licenciante se limita a la corrección de los errores en el marco del Mantenimiento. El Licenciante no responde por daños indirectos, lucro cesante ni pérdida de datos atribuibles a la Infraestructura, a la conectividad o al uso indebido del Software por la Licenciataria o terceros.</w:t>
       </w:r>
     </w:p>
     <w:p>
@@ -791,211 +781,6 @@
         <w:pStyle w:val="Heading1"/>
       </w:pPr>
       <w:r>
-        <w:t>Cláusula 6 — Infraestructura, alojamiento y costos</w:t>
-      </w:r>
-    </w:p>
-    <w:p>
-      <w:pPr>
-        <w:spacing w:after="160" w:line="276" w:lineRule="auto"/>
-        <w:jc w:val="both"/>
-      </w:pPr>
-      <w:r>
-        <w:t>6.1. La Infraestructura necesaria para ejecutar la Instancia será contratada, administrada y costeada íntegramente por la Licenciataria, bajo sus propias cuentas y a su nombre.</w:t>
-      </w:r>
-    </w:p>
-    <w:p>
-      <w:pPr>
-        <w:spacing w:after="160" w:line="276" w:lineRule="auto"/>
-        <w:jc w:val="both"/>
-      </w:pPr>
-      <w:r>
-        <w:t>6.2. Todos los costos de alojamiento, base de datos, almacenamiento, dominios y servicios asociados son de cargo exclusivo de la Licenciataria. El Licenciante no asume responsabilidad alguna por dichos costos ni por la continuidad de los servicios contratados por la Licenciataria.</w:t>
-      </w:r>
-    </w:p>
-    <w:p>
-      <w:pPr>
-        <w:spacing w:after="160" w:line="276" w:lineRule="auto"/>
-        <w:jc w:val="both"/>
-      </w:pPr>
-      <w:r>
-        <w:lastRenderedPageBreak/>
-        <w:t>6.3. La Licenciataria otorgará al Licenciante los accesos técnicos razonablemente necesarios para prestar el Mantenimiento y los Desarrollos a Medida. El Licenciante usará dichos accesos exclusivamente con esa finalidad.</w:t>
-      </w:r>
-    </w:p>
-    <w:p>
-      <w:pPr>
-        <w:pStyle w:val="Heading1"/>
-      </w:pPr>
-      <w:r>
-        <w:t>Cláusula 7 — Datos personales</w:t>
-      </w:r>
-    </w:p>
-    <w:p>
-      <w:pPr>
-        <w:spacing w:after="160" w:line="276" w:lineRule="auto"/>
-        <w:jc w:val="both"/>
-      </w:pPr>
-      <w:r>
-        <w:t>7.1. Los datos personales tratados a través del Software (entre otros, datos de clientes, documentos de identidad y evidencias de entrega) son recolectados y tratados por cuenta y bajo responsabilidad de la Licenciataria, quien reviste el carácter de responsable del tratamiento conforme a la Ley 25.326 de Protección de Datos Personales.</w:t>
-      </w:r>
-    </w:p>
-    <w:p>
-      <w:pPr>
-        <w:spacing w:after="160" w:line="276" w:lineRule="auto"/>
-        <w:jc w:val="both"/>
-      </w:pPr>
-      <w:r>
-        <w:t>7.2. El Licenciante actúa, en su caso, como prestador técnico que trata datos por cuenta de la Licenciataria, conforme a las instrucciones de esta y exclusivamente para la prestación del Mantenimiento y los Desarrollos a Medida. El Licenciante no utilizará dichos datos para fines propios.</w:t>
-      </w:r>
-    </w:p>
-    <w:p>
-      <w:pPr>
-        <w:spacing w:after="160" w:line="276" w:lineRule="auto"/>
-        <w:jc w:val="both"/>
-      </w:pPr>
-      <w:r>
-        <w:t>7.3. La Licenciataria será responsable del cumplimiento de las obligaciones legales aplicables al tratamiento de datos personales, incluyendo la obtención de los consentimientos y la atención de los derechos de los titulares de los datos.</w:t>
-      </w:r>
-    </w:p>
-    <w:p>
-      <w:pPr>
-        <w:pBdr>
-          <w:left w:val="single" w:sz="18" w:space="12" w:color="C45911"/>
-        </w:pBdr>
-        <w:spacing w:before="80" w:after="200" w:line="264" w:lineRule="auto"/>
-        <w:ind w:left="200"/>
-        <w:jc w:val="both"/>
-      </w:pPr>
-      <w:r>
-        <w:rPr>
-          <w:b/>
-          <w:bCs/>
-          <w:i/>
-          <w:iCs/>
-          <w:color w:val="C45911"/>
-        </w:rPr>
-        <w:t xml:space="preserve">Nota para revisión legal: </w:t>
-      </w:r>
-      <w:r>
-        <w:rPr>
-          <w:i/>
-          <w:iCs/>
-          <w:color w:val="595959"/>
-        </w:rPr>
-        <w:t>Según el volumen y la sensibilidad de los datos (</w:t>
-      </w:r>
-      <w:proofErr w:type="spellStart"/>
-      <w:r>
-        <w:rPr>
-          <w:i/>
-          <w:iCs/>
-          <w:color w:val="595959"/>
-        </w:rPr>
-        <w:t>DNIs</w:t>
-      </w:r>
-      <w:proofErr w:type="spellEnd"/>
-      <w:r>
-        <w:rPr>
-          <w:i/>
-          <w:iCs/>
-          <w:color w:val="595959"/>
-        </w:rPr>
-        <w:t>, imágenes), puede convenir un anexo de tratamiento de datos más detallado. Revisar la normativa vigente, dado que el régimen de protección de datos en Argentina está en proceso de actualización.</w:t>
-      </w:r>
-    </w:p>
-    <w:p>
-      <w:pPr>
-        <w:pStyle w:val="Heading1"/>
-      </w:pPr>
-      <w:r>
-        <w:t>Cláusula 8 — Confidencialidad</w:t>
-      </w:r>
-    </w:p>
-    <w:p>
-      <w:pPr>
-        <w:spacing w:after="160" w:line="276" w:lineRule="auto"/>
-        <w:jc w:val="both"/>
-      </w:pPr>
-      <w:r>
-        <w:t>8.1. Cada Parte mantendrá la confidencialidad de la información no pública de la otra a la que acceda con motivo de este Contrato, y la usará únicamente para los fines del Contrato. Esta obligación subsiste durante la vigencia y por el plazo de tres (3) años posteriores a su terminación.</w:t>
-      </w:r>
-    </w:p>
-    <w:p>
-      <w:pPr>
-        <w:spacing w:after="160" w:line="276" w:lineRule="auto"/>
-        <w:jc w:val="both"/>
-      </w:pPr>
-      <w:r>
-        <w:t>8.2. El código fuente del Software es información confidencial del Licenciante.</w:t>
-      </w:r>
-    </w:p>
-    <w:p>
-      <w:pPr>
-        <w:pStyle w:val="Heading1"/>
-      </w:pPr>
-      <w:r>
-        <w:t>Cláusula 9 — Garantías y limitación de responsabilidad</w:t>
-      </w:r>
-    </w:p>
-    <w:p>
-      <w:pPr>
-        <w:spacing w:after="160" w:line="276" w:lineRule="auto"/>
-        <w:jc w:val="both"/>
-      </w:pPr>
-      <w:r>
-        <w:t xml:space="preserve">9.1. El Software se provee “en su estado actual” (as </w:t>
-      </w:r>
-      <w:proofErr w:type="spellStart"/>
-      <w:r>
-        <w:t>is</w:t>
-      </w:r>
-      <w:proofErr w:type="spellEnd"/>
-      <w:r>
-        <w:t>). El Licenciante no garantiza que el Software esté libre de errores ni que su funcionamiento sea ininterrumpido, especialmente respecto de las prestaciones provistas sin cargo.</w:t>
-      </w:r>
-    </w:p>
-    <w:p>
-      <w:pPr>
-        <w:spacing w:after="160" w:line="276" w:lineRule="auto"/>
-        <w:jc w:val="both"/>
-      </w:pPr>
-      <w:r>
-        <w:t>9.2. En la máxima medida permitida por la ley, la responsabilidad del Licenciante se limita a la corrección de los errores en el marco del Mantenimiento. El Licenciante no responde por daños indirectos, lucro cesante ni pérdida de datos atribuibles a la Infraestructura, a la conectividad o al uso indebido del Software por la Licenciataria o terceros.</w:t>
-      </w:r>
-    </w:p>
-    <w:p>
-      <w:pPr>
-        <w:pBdr>
-          <w:left w:val="single" w:sz="18" w:space="12" w:color="C45911"/>
-        </w:pBdr>
-        <w:spacing w:before="80" w:after="200" w:line="264" w:lineRule="auto"/>
-        <w:ind w:left="200"/>
-        <w:jc w:val="both"/>
-      </w:pPr>
-      <w:r>
-        <w:rPr>
-          <w:b/>
-          <w:bCs/>
-          <w:i/>
-          <w:iCs/>
-          <w:color w:val="C45911"/>
-        </w:rPr>
-        <w:t xml:space="preserve">Nota para revisión legal: </w:t>
-      </w:r>
-      <w:r>
-        <w:rPr>
-          <w:i/>
-          <w:iCs/>
-          <w:color w:val="595959"/>
-        </w:rPr>
-        <w:t>Las cláusulas de limitación de responsabilidad tienen límites en el derecho argentino (no se puede dispensar el dolo, por ejemplo). El abogado debe calibrar el alcance para que sean válidas y exigibles.</w:t>
-      </w:r>
-    </w:p>
-    <w:p>
-      <w:pPr>
-        <w:pStyle w:val="Heading1"/>
-      </w:pPr>
-      <w:r>
         <w:t>Cláusula 10 — Plazo y terminación</w:t>
       </w:r>
     </w:p>
@@ -1005,7 +790,6 @@
         <w:jc w:val="both"/>
       </w:pPr>
       <w:r>
-        <w:lastRenderedPageBreak/>
         <w:t xml:space="preserve">10.1. El Contrato tiene vigencia por tiempo indeterminado. Cualquiera de las Partes podrá rescindirlo sin expresión de causa mediante aviso por escrito con una antelación no menor a </w:t>
       </w:r>
       <w:r>
@@ -1040,34 +824,6 @@
     </w:p>
     <w:p>
       <w:pPr>
-        <w:pBdr>
-          <w:left w:val="single" w:sz="18" w:space="12" w:color="C45911"/>
-        </w:pBdr>
-        <w:spacing w:before="80" w:after="200" w:line="264" w:lineRule="auto"/>
-        <w:ind w:left="200"/>
-        <w:jc w:val="both"/>
-      </w:pPr>
-      <w:r>
-        <w:rPr>
-          <w:b/>
-          <w:bCs/>
-          <w:i/>
-          <w:iCs/>
-          <w:color w:val="C45911"/>
-        </w:rPr>
-        <w:t xml:space="preserve">Nota para revisión legal: </w:t>
-      </w:r>
-      <w:r>
-        <w:rPr>
-          <w:i/>
-          <w:iCs/>
-          <w:color w:val="595959"/>
-        </w:rPr>
-        <w:t>Decidir el efecto exacto de la terminación: ¿la Licenciataria puede seguir usando la última Versión Estable, o cesa todo uso? Es una decisión de negocio importante. Definir también el plazo y mecanismo de entrega/exportación de datos.</w:t>
-      </w:r>
-    </w:p>
-    <w:p>
-      <w:pPr>
         <w:pStyle w:val="Heading1"/>
       </w:pPr>
       <w:r>
@@ -1163,6 +919,18 @@
       <w:r>
         <w:t>13.3. Las Partes constituyen domicilios especiales en los indicados en el encabezado, donde se tendrán por válidas todas las notificaciones.</w:t>
       </w:r>
+    </w:p>
+    <w:p>
+      <w:pPr>
+        <w:spacing w:after="160" w:line="276" w:lineRule="auto"/>
+        <w:jc w:val="both"/>
+      </w:pPr>
+    </w:p>
+    <w:p>
+      <w:pPr>
+        <w:spacing w:after="160" w:line="276" w:lineRule="auto"/>
+        <w:jc w:val="both"/>
+      </w:pPr>
     </w:p>
     <w:p>
       <w:pPr>
@@ -1236,10 +1004,20 @@
     </w:p>
     <w:p>
       <w:pPr>
-        <w:spacing w:before="600" w:after="60"/>
-      </w:pPr>
-      <w:r>
-        <w:t>______________________________                              ______________________________</w:t>
+        <w:spacing w:after="40"/>
+      </w:pPr>
+    </w:p>
+    <w:p>
+      <w:pPr>
+        <w:spacing w:after="40"/>
+      </w:pPr>
+    </w:p>
+    <w:p>
+      <w:pPr>
+        <w:spacing w:after="40"/>
+      </w:pPr>
+      <w:r>
+        <w:t>___________________________                                    ___________________________</w:t>
       </w:r>
     </w:p>
     <w:p>
@@ -1263,9 +1041,8 @@
           <w:sz w:val="20"/>
           <w:szCs w:val="20"/>
         </w:rPr>
-        <w:t xml:space="preserve">Mathias [apellido] — DNI [...]                                </w:t>
-      </w:r>
-      <w:proofErr w:type="gramStart"/>
+        <w:t xml:space="preserve">Mathias </w:t>
+      </w:r>
       <w:r>
         <w:rPr>
           <w:i/>
@@ -1274,9 +1051,8 @@
           <w:sz w:val="20"/>
           <w:szCs w:val="20"/>
         </w:rPr>
-        <w:t xml:space="preserve">   [</w:t>
-      </w:r>
-      <w:proofErr w:type="gramEnd"/>
+        <w:t>Villanueva</w:t>
+      </w:r>
       <w:r>
         <w:rPr>
           <w:i/>
@@ -1285,7 +1061,69 @@
           <w:sz w:val="20"/>
           <w:szCs w:val="20"/>
         </w:rPr>
-        <w:t>Razón social] — CUIT [...]</w:t>
+        <w:t xml:space="preserve"> — DNI </w:t>
+      </w:r>
+      <w:r>
+        <w:rPr>
+          <w:i/>
+          <w:iCs/>
+          <w:color w:val="595959"/>
+          <w:sz w:val="20"/>
+          <w:szCs w:val="20"/>
+        </w:rPr>
+        <w:t>41122737</w:t>
+      </w:r>
+      <w:r>
+        <w:rPr>
+          <w:i/>
+          <w:iCs/>
+          <w:color w:val="595959"/>
+          <w:sz w:val="20"/>
+          <w:szCs w:val="20"/>
+        </w:rPr>
+        <w:t xml:space="preserve">                                   </w:t>
+      </w:r>
+      <w:proofErr w:type="spellStart"/>
+      <w:r>
+        <w:rPr>
+          <w:i/>
+          <w:iCs/>
+          <w:color w:val="595959"/>
+          <w:sz w:val="20"/>
+          <w:szCs w:val="20"/>
+        </w:rPr>
+        <w:t>Yuriti</w:t>
+      </w:r>
+      <w:proofErr w:type="spellEnd"/>
+      <w:r>
+        <w:rPr>
+          <w:i/>
+          <w:iCs/>
+          <w:color w:val="595959"/>
+          <w:sz w:val="20"/>
+          <w:szCs w:val="20"/>
+        </w:rPr>
+        <w:t xml:space="preserve"> S.A.</w:t>
+      </w:r>
+      <w:r>
+        <w:rPr>
+          <w:i/>
+          <w:iCs/>
+          <w:color w:val="595959"/>
+          <w:sz w:val="20"/>
+          <w:szCs w:val="20"/>
+        </w:rPr>
+        <w:t xml:space="preserve"> — CUIT </w:t>
+      </w:r>
+      <w:r>
+        <w:rPr>
+          <w:i/>
+          <w:iCs/>
+          <w:color w:val="595959"/>
+          <w:sz w:val="20"/>
+          <w:szCs w:val="20"/>
+        </w:rPr>
+        <w:t>30-70873710-7</w:t>
       </w:r>
     </w:p>
     <w:sectPr>

</xml_diff>